<commit_message>
Substituir modelo pela etiqueta de retorno
</commit_message>
<xml_diff>
--- a/assets/modelo_envio_amostras_oleo.docx
+++ b/assets/modelo_envio_amostras_oleo.docx
@@ -7,19 +7,20 @@
         <w:tblW w:w="0" w:type="auto"/>
         <w:jc w:val="center"/>
         <w:tblBorders>
-          <w:top w:val="nil"/>
-          <w:left w:val="nil"/>
-          <w:bottom w:val="nil"/>
-          <w:right w:val="nil"/>
-          <w:insideH w:val="nil"/>
-          <w:insideV w:val="dashed" w:sz="6" w:space="0" w:color="9AA5A0"/>
+          <w:top w:val="single" w:sz="24" w:space="0" w:color="000000"/>
+          <w:left w:val="single" w:sz="24" w:space="0" w:color="000000"/>
+          <w:bottom w:val="single" w:sz="24" w:space="0" w:color="000000"/>
+          <w:right w:val="single" w:sz="24" w:space="0" w:color="000000"/>
+          <w:insideH w:val="single" w:sz="96" w:space="0" w:color="000000"/>
+          <w:insideV w:val="single" w:sz="96" w:space="0" w:color="000000"/>
         </w:tblBorders>
         <w:tblLayout w:type="fixed"/>
         <w:tblLook w:val="04A0" w:firstRow="1" w:lastRow="0" w:firstColumn="1" w:lastColumn="0" w:noHBand="0" w:noVBand="1"/>
       </w:tblPr>
       <w:tblGrid>
-        <w:gridCol w:w="8334"/>
-        <w:gridCol w:w="8334"/>
+        <w:gridCol w:w="8184"/>
+        <w:gridCol w:w="300"/>
+        <w:gridCol w:w="8184"/>
       </w:tblGrid>
       <w:tr>
         <w:trPr>
@@ -28,7 +29,7 @@
         </w:trPr>
         <w:tc>
           <w:tcPr>
-            <w:tcW w:w="8334" w:type="dxa"/>
+            <w:tcW w:w="8184" w:type="dxa"/>
             <w:tcMar>
               <w:top w:w="80" w:type="dxa"/>
               <w:left w:w="120" w:type="dxa"/>
@@ -36,6 +37,12 @@
               <w:right w:w="120" w:type="dxa"/>
             </w:tcMar>
             <w:vAlign w:val="center"/>
+            <w:tcBorders>
+              <w:top w:val="single" w:sz="96" w:space="0" w:color="000000"/>
+              <w:left w:val="single" w:sz="96" w:space="0" w:color="000000"/>
+              <w:bottom w:val="single" w:sz="96" w:space="0" w:color="000000"/>
+              <w:right w:val="single" w:sz="96" w:space="0" w:color="000000"/>
+            </w:tcBorders>
           </w:tcPr>
           <w:p>
             <w:pPr>
@@ -103,10 +110,10 @@
               <w:tblW w:w="0" w:type="auto"/>
               <w:jc w:val="center"/>
               <w:tblBorders>
-                <w:top w:val="single" w:sz="10" w:space="0" w:color="007A3D"/>
-                <w:left w:val="single" w:sz="10" w:space="0" w:color="007A3D"/>
-                <w:bottom w:val="single" w:sz="10" w:space="0" w:color="007A3D"/>
-                <w:right w:val="single" w:sz="10" w:space="0" w:color="007A3D"/>
+                <w:top w:val="single" w:sz="96" w:space="0" w:color="000000"/>
+                <w:left w:val="single" w:sz="96" w:space="0" w:color="000000"/>
+                <w:bottom w:val="single" w:sz="96" w:space="0" w:color="000000"/>
+                <w:right w:val="single" w:sz="96" w:space="0" w:color="000000"/>
               </w:tblBorders>
               <w:tblLayout w:type="fixed"/>
               <w:tblLook w:val="04A0" w:firstRow="1" w:lastRow="0" w:firstColumn="1" w:lastColumn="0" w:noHBand="0" w:noVBand="1"/>
@@ -142,7 +149,7 @@
                       <w:color w:val="FFFFFF"/>
                       <w:sz w:val="46"/>
                     </w:rPr>
-                    <w:t xml:space="preserve">UTE </w:t>
+                    <w:t xml:space="preserve">UTE - BARREIRINHA</w:t>
                   </w:r>
                 </w:p>
               </w:tc>
@@ -159,10 +166,10 @@
               <w:tblW w:w="0" w:type="auto"/>
               <w:jc w:val="center"/>
               <w:tblBorders>
-                <w:top w:val="single" w:sz="10" w:space="0" w:color="007A3D"/>
-                <w:left w:val="single" w:sz="10" w:space="0" w:color="007A3D"/>
-                <w:bottom w:val="single" w:sz="10" w:space="0" w:color="007A3D"/>
-                <w:right w:val="single" w:sz="10" w:space="0" w:color="007A3D"/>
+                <w:top w:val="single" w:sz="96" w:space="0" w:color="000000"/>
+                <w:left w:val="single" w:sz="96" w:space="0" w:color="000000"/>
+                <w:bottom w:val="single" w:sz="96" w:space="0" w:color="000000"/>
+                <w:right w:val="single" w:sz="96" w:space="0" w:color="000000"/>
               </w:tblBorders>
               <w:tblLayout w:type="fixed"/>
               <w:tblLook w:val="04A0" w:firstRow="1" w:lastRow="0" w:firstColumn="1" w:lastColumn="0" w:noHBand="0" w:noVBand="1"/>
@@ -226,10 +233,10 @@
               <w:tblW w:w="0" w:type="auto"/>
               <w:jc w:val="center"/>
               <w:tblBorders>
-                <w:top w:val="single" w:sz="10" w:space="0" w:color="007A3D"/>
-                <w:left w:val="single" w:sz="10" w:space="0" w:color="007A3D"/>
-                <w:bottom w:val="single" w:sz="10" w:space="0" w:color="007A3D"/>
-                <w:right w:val="single" w:sz="10" w:space="0" w:color="007A3D"/>
+                <w:top w:val="single" w:sz="96" w:space="0" w:color="000000"/>
+                <w:left w:val="single" w:sz="96" w:space="0" w:color="000000"/>
+                <w:bottom w:val="single" w:sz="96" w:space="0" w:color="000000"/>
+                <w:right w:val="single" w:sz="96" w:space="0" w:color="000000"/>
               </w:tblBorders>
               <w:tblLayout w:type="fixed"/>
               <w:tblLook w:val="04A0" w:firstRow="1" w:lastRow="0" w:firstColumn="1" w:lastColumn="0" w:noHBand="0" w:noVBand="1"/>
@@ -265,7 +272,7 @@
                       <w:color w:val="000000"/>
                       <w:sz w:val="40"/>
                     </w:rPr>
-                    <w:t>00</w:t>
+                    <w:t>01 AMOSTRAS DE ÓLEO</w:t>
                   </w:r>
                   <w:r>
                     <w:rPr>
@@ -273,7 +280,7 @@
                       <w:color w:val="000000"/>
                       <w:sz w:val="40"/>
                     </w:rPr>
-                    <w:t xml:space="preserve"> AMOSTRAS DE ÓLEO</w:t>
+                    <w:t xml:space="preserve"/>
                   </w:r>
                 </w:p>
               </w:tc>
@@ -290,10 +297,10 @@
               <w:tblW w:w="0" w:type="auto"/>
               <w:jc w:val="center"/>
               <w:tblBorders>
-                <w:top w:val="single" w:sz="10" w:space="0" w:color="007A3D"/>
-                <w:left w:val="single" w:sz="10" w:space="0" w:color="007A3D"/>
-                <w:bottom w:val="single" w:sz="10" w:space="0" w:color="007A3D"/>
-                <w:right w:val="single" w:sz="10" w:space="0" w:color="007A3D"/>
+                <w:top w:val="single" w:sz="96" w:space="0" w:color="000000"/>
+                <w:left w:val="single" w:sz="96" w:space="0" w:color="000000"/>
+                <w:bottom w:val="single" w:sz="96" w:space="0" w:color="000000"/>
+                <w:right w:val="single" w:sz="96" w:space="0" w:color="000000"/>
               </w:tblBorders>
               <w:tblLayout w:type="fixed"/>
               <w:tblLook w:val="04A0" w:firstRow="1" w:lastRow="0" w:firstColumn="1" w:lastColumn="0" w:noHBand="0" w:noVBand="1"/>
@@ -354,10 +361,10 @@
               <w:tblW w:w="0" w:type="auto"/>
               <w:jc w:val="center"/>
               <w:tblBorders>
-                <w:top w:val="single" w:sz="10" w:space="0" w:color="007A3D"/>
-                <w:left w:val="single" w:sz="10" w:space="0" w:color="007A3D"/>
-                <w:bottom w:val="single" w:sz="10" w:space="0" w:color="007A3D"/>
-                <w:right w:val="single" w:sz="10" w:space="0" w:color="007A3D"/>
+                <w:top w:val="single" w:sz="96" w:space="0" w:color="000000"/>
+                <w:left w:val="single" w:sz="96" w:space="0" w:color="000000"/>
+                <w:bottom w:val="single" w:sz="96" w:space="0" w:color="000000"/>
+                <w:right w:val="single" w:sz="96" w:space="0" w:color="000000"/>
               </w:tblBorders>
               <w:tblLayout w:type="fixed"/>
               <w:tblLook w:val="04A0" w:firstRow="1" w:lastRow="0" w:firstColumn="1" w:lastColumn="0" w:noHBand="0" w:noVBand="1"/>
@@ -393,7 +400,7 @@
                       <w:color w:val="000000"/>
                       <w:sz w:val="40"/>
                     </w:rPr>
-                    <w:t>DATA: 00 / 00 / 2026</w:t>
+                    <w:t>DATA: 31/08/2026</w:t>
                   </w:r>
                 </w:p>
               </w:tc>
@@ -408,7 +415,19 @@
         </w:tc>
         <w:tc>
           <w:tcPr>
-            <w:tcW w:w="8334" w:type="dxa"/>
+            <w:tcW w:w="300" w:type="dxa"/>
+            <w:tcBorders>
+              <w:top w:val="nil"/>
+              <w:left w:val="nil"/>
+              <w:bottom w:val="nil"/>
+              <w:right w:val="nil"/>
+            </w:tcBorders>
+          </w:tcPr>
+          <w:p/>
+        </w:tc>
+        <w:tc>
+          <w:tcPr>
+            <w:tcW w:w="8184" w:type="dxa"/>
             <w:tcMar>
               <w:top w:w="80" w:type="dxa"/>
               <w:left w:w="120" w:type="dxa"/>
@@ -416,6 +435,12 @@
               <w:right w:w="120" w:type="dxa"/>
             </w:tcMar>
             <w:vAlign w:val="center"/>
+            <w:tcBorders>
+              <w:top w:val="single" w:sz="96" w:space="0" w:color="000000"/>
+              <w:left w:val="single" w:sz="96" w:space="0" w:color="000000"/>
+              <w:bottom w:val="single" w:sz="96" w:space="0" w:color="000000"/>
+              <w:right w:val="single" w:sz="96" w:space="0" w:color="000000"/>
+            </w:tcBorders>
           </w:tcPr>
           <w:p>
             <w:pPr>
@@ -483,10 +508,10 @@
               <w:tblW w:w="0" w:type="auto"/>
               <w:jc w:val="center"/>
               <w:tblBorders>
-                <w:top w:val="single" w:sz="10" w:space="0" w:color="007A3D"/>
-                <w:left w:val="single" w:sz="10" w:space="0" w:color="007A3D"/>
-                <w:bottom w:val="single" w:sz="10" w:space="0" w:color="007A3D"/>
-                <w:right w:val="single" w:sz="10" w:space="0" w:color="007A3D"/>
+                <w:top w:val="single" w:sz="96" w:space="0" w:color="000000"/>
+                <w:left w:val="single" w:sz="96" w:space="0" w:color="000000"/>
+                <w:bottom w:val="single" w:sz="96" w:space="0" w:color="000000"/>
+                <w:right w:val="single" w:sz="96" w:space="0" w:color="000000"/>
               </w:tblBorders>
               <w:tblLayout w:type="fixed"/>
               <w:tblLook w:val="04A0" w:firstRow="1" w:lastRow="0" w:firstColumn="1" w:lastColumn="0" w:noHBand="0" w:noVBand="1"/>
@@ -522,7 +547,7 @@
                       <w:color w:val="FFFFFF"/>
                       <w:sz w:val="46"/>
                     </w:rPr>
-                    <w:t xml:space="preserve">UTE - </w:t>
+                    <w:t xml:space="preserve">UTE - BARREIRINHA</w:t>
                   </w:r>
                 </w:p>
               </w:tc>
@@ -539,10 +564,10 @@
               <w:tblW w:w="0" w:type="auto"/>
               <w:jc w:val="center"/>
               <w:tblBorders>
-                <w:top w:val="single" w:sz="10" w:space="0" w:color="007A3D"/>
-                <w:left w:val="single" w:sz="10" w:space="0" w:color="007A3D"/>
-                <w:bottom w:val="single" w:sz="10" w:space="0" w:color="007A3D"/>
-                <w:right w:val="single" w:sz="10" w:space="0" w:color="007A3D"/>
+                <w:top w:val="single" w:sz="96" w:space="0" w:color="000000"/>
+                <w:left w:val="single" w:sz="96" w:space="0" w:color="000000"/>
+                <w:bottom w:val="single" w:sz="96" w:space="0" w:color="000000"/>
+                <w:right w:val="single" w:sz="96" w:space="0" w:color="000000"/>
               </w:tblBorders>
               <w:tblLayout w:type="fixed"/>
               <w:tblLook w:val="04A0" w:firstRow="1" w:lastRow="0" w:firstColumn="1" w:lastColumn="0" w:noHBand="0" w:noVBand="1"/>
@@ -606,10 +631,10 @@
               <w:tblW w:w="0" w:type="auto"/>
               <w:jc w:val="center"/>
               <w:tblBorders>
-                <w:top w:val="single" w:sz="10" w:space="0" w:color="007A3D"/>
-                <w:left w:val="single" w:sz="10" w:space="0" w:color="007A3D"/>
-                <w:bottom w:val="single" w:sz="10" w:space="0" w:color="007A3D"/>
-                <w:right w:val="single" w:sz="10" w:space="0" w:color="007A3D"/>
+                <w:top w:val="single" w:sz="96" w:space="0" w:color="000000"/>
+                <w:left w:val="single" w:sz="96" w:space="0" w:color="000000"/>
+                <w:bottom w:val="single" w:sz="96" w:space="0" w:color="000000"/>
+                <w:right w:val="single" w:sz="96" w:space="0" w:color="000000"/>
               </w:tblBorders>
               <w:tblLayout w:type="fixed"/>
               <w:tblLook w:val="04A0" w:firstRow="1" w:lastRow="0" w:firstColumn="1" w:lastColumn="0" w:noHBand="0" w:noVBand="1"/>
@@ -645,7 +670,7 @@
                       <w:color w:val="000000"/>
                       <w:sz w:val="40"/>
                     </w:rPr>
-                    <w:t>00</w:t>
+                    <w:t>01 AMOSTRAS DE ÓLEO</w:t>
                   </w:r>
                   <w:r>
                     <w:rPr>
@@ -653,7 +678,7 @@
                       <w:color w:val="000000"/>
                       <w:sz w:val="40"/>
                     </w:rPr>
-                    <w:t xml:space="preserve"> AMOSTRAS DE ÓLEO</w:t>
+                    <w:t xml:space="preserve"/>
                   </w:r>
                 </w:p>
               </w:tc>
@@ -670,10 +695,10 @@
               <w:tblW w:w="0" w:type="auto"/>
               <w:jc w:val="center"/>
               <w:tblBorders>
-                <w:top w:val="single" w:sz="10" w:space="0" w:color="007A3D"/>
-                <w:left w:val="single" w:sz="10" w:space="0" w:color="007A3D"/>
-                <w:bottom w:val="single" w:sz="10" w:space="0" w:color="007A3D"/>
-                <w:right w:val="single" w:sz="10" w:space="0" w:color="007A3D"/>
+                <w:top w:val="single" w:sz="96" w:space="0" w:color="000000"/>
+                <w:left w:val="single" w:sz="96" w:space="0" w:color="000000"/>
+                <w:bottom w:val="single" w:sz="96" w:space="0" w:color="000000"/>
+                <w:right w:val="single" w:sz="96" w:space="0" w:color="000000"/>
               </w:tblBorders>
               <w:tblLayout w:type="fixed"/>
               <w:tblLook w:val="04A0" w:firstRow="1" w:lastRow="0" w:firstColumn="1" w:lastColumn="0" w:noHBand="0" w:noVBand="1"/>
@@ -737,10 +762,10 @@
               <w:tblW w:w="0" w:type="auto"/>
               <w:jc w:val="center"/>
               <w:tblBorders>
-                <w:top w:val="single" w:sz="10" w:space="0" w:color="007A3D"/>
-                <w:left w:val="single" w:sz="10" w:space="0" w:color="007A3D"/>
-                <w:bottom w:val="single" w:sz="10" w:space="0" w:color="007A3D"/>
-                <w:right w:val="single" w:sz="10" w:space="0" w:color="007A3D"/>
+                <w:top w:val="single" w:sz="96" w:space="0" w:color="000000"/>
+                <w:left w:val="single" w:sz="96" w:space="0" w:color="000000"/>
+                <w:bottom w:val="single" w:sz="96" w:space="0" w:color="000000"/>
+                <w:right w:val="single" w:sz="96" w:space="0" w:color="000000"/>
               </w:tblBorders>
               <w:tblLayout w:type="fixed"/>
               <w:tblLook w:val="04A0" w:firstRow="1" w:lastRow="0" w:firstColumn="1" w:lastColumn="0" w:noHBand="0" w:noVBand="1"/>
@@ -776,7 +801,7 @@
                       <w:color w:val="000000"/>
                       <w:sz w:val="40"/>
                     </w:rPr>
-                    <w:t>DATA: 00 / 00 / 2026</w:t>
+                    <w:t>DATA: 31/08/2026</w:t>
                   </w:r>
                 </w:p>
               </w:tc>

</xml_diff>

<commit_message>
Restaurar etiqueta de retorno anterior
</commit_message>
<xml_diff>
--- a/assets/modelo_envio_amostras_oleo.docx
+++ b/assets/modelo_envio_amostras_oleo.docx
@@ -7,20 +7,19 @@
         <w:tblW w:w="0" w:type="auto"/>
         <w:jc w:val="center"/>
         <w:tblBorders>
-          <w:top w:val="single" w:sz="24" w:space="0" w:color="000000"/>
-          <w:left w:val="single" w:sz="24" w:space="0" w:color="000000"/>
-          <w:bottom w:val="single" w:sz="24" w:space="0" w:color="000000"/>
-          <w:right w:val="single" w:sz="24" w:space="0" w:color="000000"/>
-          <w:insideH w:val="single" w:sz="96" w:space="0" w:color="000000"/>
-          <w:insideV w:val="single" w:sz="96" w:space="0" w:color="000000"/>
+          <w:top w:val="nil"/>
+          <w:left w:val="nil"/>
+          <w:bottom w:val="nil"/>
+          <w:right w:val="nil"/>
+          <w:insideH w:val="nil"/>
+          <w:insideV w:val="dashed" w:sz="6" w:space="0" w:color="9AA5A0"/>
         </w:tblBorders>
         <w:tblLayout w:type="fixed"/>
         <w:tblLook w:val="04A0" w:firstRow="1" w:lastRow="0" w:firstColumn="1" w:lastColumn="0" w:noHBand="0" w:noVBand="1"/>
       </w:tblPr>
       <w:tblGrid>
-        <w:gridCol w:w="8184"/>
-        <w:gridCol w:w="300"/>
-        <w:gridCol w:w="8184"/>
+        <w:gridCol w:w="8334"/>
+        <w:gridCol w:w="8334"/>
       </w:tblGrid>
       <w:tr>
         <w:trPr>
@@ -29,7 +28,7 @@
         </w:trPr>
         <w:tc>
           <w:tcPr>
-            <w:tcW w:w="8184" w:type="dxa"/>
+            <w:tcW w:w="8334" w:type="dxa"/>
             <w:tcMar>
               <w:top w:w="80" w:type="dxa"/>
               <w:left w:w="120" w:type="dxa"/>
@@ -37,12 +36,6 @@
               <w:right w:w="120" w:type="dxa"/>
             </w:tcMar>
             <w:vAlign w:val="center"/>
-            <w:tcBorders>
-              <w:top w:val="single" w:sz="96" w:space="0" w:color="000000"/>
-              <w:left w:val="single" w:sz="96" w:space="0" w:color="000000"/>
-              <w:bottom w:val="single" w:sz="96" w:space="0" w:color="000000"/>
-              <w:right w:val="single" w:sz="96" w:space="0" w:color="000000"/>
-            </w:tcBorders>
           </w:tcPr>
           <w:p>
             <w:pPr>
@@ -110,10 +103,10 @@
               <w:tblW w:w="0" w:type="auto"/>
               <w:jc w:val="center"/>
               <w:tblBorders>
-                <w:top w:val="single" w:sz="96" w:space="0" w:color="000000"/>
-                <w:left w:val="single" w:sz="96" w:space="0" w:color="000000"/>
-                <w:bottom w:val="single" w:sz="96" w:space="0" w:color="000000"/>
-                <w:right w:val="single" w:sz="96" w:space="0" w:color="000000"/>
+                <w:top w:val="single" w:sz="10" w:space="0" w:color="007A3D"/>
+                <w:left w:val="single" w:sz="10" w:space="0" w:color="007A3D"/>
+                <w:bottom w:val="single" w:sz="10" w:space="0" w:color="007A3D"/>
+                <w:right w:val="single" w:sz="10" w:space="0" w:color="007A3D"/>
               </w:tblBorders>
               <w:tblLayout w:type="fixed"/>
               <w:tblLook w:val="04A0" w:firstRow="1" w:lastRow="0" w:firstColumn="1" w:lastColumn="0" w:noHBand="0" w:noVBand="1"/>
@@ -149,7 +142,7 @@
                       <w:color w:val="FFFFFF"/>
                       <w:sz w:val="46"/>
                     </w:rPr>
-                    <w:t xml:space="preserve">UTE - BARREIRINHA</w:t>
+                    <w:t xml:space="preserve">UTE </w:t>
                   </w:r>
                 </w:p>
               </w:tc>
@@ -166,10 +159,10 @@
               <w:tblW w:w="0" w:type="auto"/>
               <w:jc w:val="center"/>
               <w:tblBorders>
-                <w:top w:val="single" w:sz="96" w:space="0" w:color="000000"/>
-                <w:left w:val="single" w:sz="96" w:space="0" w:color="000000"/>
-                <w:bottom w:val="single" w:sz="96" w:space="0" w:color="000000"/>
-                <w:right w:val="single" w:sz="96" w:space="0" w:color="000000"/>
+                <w:top w:val="single" w:sz="10" w:space="0" w:color="007A3D"/>
+                <w:left w:val="single" w:sz="10" w:space="0" w:color="007A3D"/>
+                <w:bottom w:val="single" w:sz="10" w:space="0" w:color="007A3D"/>
+                <w:right w:val="single" w:sz="10" w:space="0" w:color="007A3D"/>
               </w:tblBorders>
               <w:tblLayout w:type="fixed"/>
               <w:tblLook w:val="04A0" w:firstRow="1" w:lastRow="0" w:firstColumn="1" w:lastColumn="0" w:noHBand="0" w:noVBand="1"/>
@@ -233,10 +226,10 @@
               <w:tblW w:w="0" w:type="auto"/>
               <w:jc w:val="center"/>
               <w:tblBorders>
-                <w:top w:val="single" w:sz="96" w:space="0" w:color="000000"/>
-                <w:left w:val="single" w:sz="96" w:space="0" w:color="000000"/>
-                <w:bottom w:val="single" w:sz="96" w:space="0" w:color="000000"/>
-                <w:right w:val="single" w:sz="96" w:space="0" w:color="000000"/>
+                <w:top w:val="single" w:sz="10" w:space="0" w:color="007A3D"/>
+                <w:left w:val="single" w:sz="10" w:space="0" w:color="007A3D"/>
+                <w:bottom w:val="single" w:sz="10" w:space="0" w:color="007A3D"/>
+                <w:right w:val="single" w:sz="10" w:space="0" w:color="007A3D"/>
               </w:tblBorders>
               <w:tblLayout w:type="fixed"/>
               <w:tblLook w:val="04A0" w:firstRow="1" w:lastRow="0" w:firstColumn="1" w:lastColumn="0" w:noHBand="0" w:noVBand="1"/>
@@ -272,7 +265,7 @@
                       <w:color w:val="000000"/>
                       <w:sz w:val="40"/>
                     </w:rPr>
-                    <w:t>01 AMOSTRAS DE ÓLEO</w:t>
+                    <w:t>00</w:t>
                   </w:r>
                   <w:r>
                     <w:rPr>
@@ -280,7 +273,7 @@
                       <w:color w:val="000000"/>
                       <w:sz w:val="40"/>
                     </w:rPr>
-                    <w:t xml:space="preserve"/>
+                    <w:t xml:space="preserve"> AMOSTRAS DE ÓLEO</w:t>
                   </w:r>
                 </w:p>
               </w:tc>
@@ -297,10 +290,10 @@
               <w:tblW w:w="0" w:type="auto"/>
               <w:jc w:val="center"/>
               <w:tblBorders>
-                <w:top w:val="single" w:sz="96" w:space="0" w:color="000000"/>
-                <w:left w:val="single" w:sz="96" w:space="0" w:color="000000"/>
-                <w:bottom w:val="single" w:sz="96" w:space="0" w:color="000000"/>
-                <w:right w:val="single" w:sz="96" w:space="0" w:color="000000"/>
+                <w:top w:val="single" w:sz="10" w:space="0" w:color="007A3D"/>
+                <w:left w:val="single" w:sz="10" w:space="0" w:color="007A3D"/>
+                <w:bottom w:val="single" w:sz="10" w:space="0" w:color="007A3D"/>
+                <w:right w:val="single" w:sz="10" w:space="0" w:color="007A3D"/>
               </w:tblBorders>
               <w:tblLayout w:type="fixed"/>
               <w:tblLook w:val="04A0" w:firstRow="1" w:lastRow="0" w:firstColumn="1" w:lastColumn="0" w:noHBand="0" w:noVBand="1"/>
@@ -361,10 +354,10 @@
               <w:tblW w:w="0" w:type="auto"/>
               <w:jc w:val="center"/>
               <w:tblBorders>
-                <w:top w:val="single" w:sz="96" w:space="0" w:color="000000"/>
-                <w:left w:val="single" w:sz="96" w:space="0" w:color="000000"/>
-                <w:bottom w:val="single" w:sz="96" w:space="0" w:color="000000"/>
-                <w:right w:val="single" w:sz="96" w:space="0" w:color="000000"/>
+                <w:top w:val="single" w:sz="10" w:space="0" w:color="007A3D"/>
+                <w:left w:val="single" w:sz="10" w:space="0" w:color="007A3D"/>
+                <w:bottom w:val="single" w:sz="10" w:space="0" w:color="007A3D"/>
+                <w:right w:val="single" w:sz="10" w:space="0" w:color="007A3D"/>
               </w:tblBorders>
               <w:tblLayout w:type="fixed"/>
               <w:tblLook w:val="04A0" w:firstRow="1" w:lastRow="0" w:firstColumn="1" w:lastColumn="0" w:noHBand="0" w:noVBand="1"/>
@@ -400,7 +393,7 @@
                       <w:color w:val="000000"/>
                       <w:sz w:val="40"/>
                     </w:rPr>
-                    <w:t>DATA: 31/08/2026</w:t>
+                    <w:t>DATA: 00 / 00 / 2026</w:t>
                   </w:r>
                 </w:p>
               </w:tc>
@@ -415,19 +408,7 @@
         </w:tc>
         <w:tc>
           <w:tcPr>
-            <w:tcW w:w="300" w:type="dxa"/>
-            <w:tcBorders>
-              <w:top w:val="nil"/>
-              <w:left w:val="nil"/>
-              <w:bottom w:val="nil"/>
-              <w:right w:val="nil"/>
-            </w:tcBorders>
-          </w:tcPr>
-          <w:p/>
-        </w:tc>
-        <w:tc>
-          <w:tcPr>
-            <w:tcW w:w="8184" w:type="dxa"/>
+            <w:tcW w:w="8334" w:type="dxa"/>
             <w:tcMar>
               <w:top w:w="80" w:type="dxa"/>
               <w:left w:w="120" w:type="dxa"/>
@@ -435,12 +416,6 @@
               <w:right w:w="120" w:type="dxa"/>
             </w:tcMar>
             <w:vAlign w:val="center"/>
-            <w:tcBorders>
-              <w:top w:val="single" w:sz="96" w:space="0" w:color="000000"/>
-              <w:left w:val="single" w:sz="96" w:space="0" w:color="000000"/>
-              <w:bottom w:val="single" w:sz="96" w:space="0" w:color="000000"/>
-              <w:right w:val="single" w:sz="96" w:space="0" w:color="000000"/>
-            </w:tcBorders>
           </w:tcPr>
           <w:p>
             <w:pPr>
@@ -508,10 +483,10 @@
               <w:tblW w:w="0" w:type="auto"/>
               <w:jc w:val="center"/>
               <w:tblBorders>
-                <w:top w:val="single" w:sz="96" w:space="0" w:color="000000"/>
-                <w:left w:val="single" w:sz="96" w:space="0" w:color="000000"/>
-                <w:bottom w:val="single" w:sz="96" w:space="0" w:color="000000"/>
-                <w:right w:val="single" w:sz="96" w:space="0" w:color="000000"/>
+                <w:top w:val="single" w:sz="10" w:space="0" w:color="007A3D"/>
+                <w:left w:val="single" w:sz="10" w:space="0" w:color="007A3D"/>
+                <w:bottom w:val="single" w:sz="10" w:space="0" w:color="007A3D"/>
+                <w:right w:val="single" w:sz="10" w:space="0" w:color="007A3D"/>
               </w:tblBorders>
               <w:tblLayout w:type="fixed"/>
               <w:tblLook w:val="04A0" w:firstRow="1" w:lastRow="0" w:firstColumn="1" w:lastColumn="0" w:noHBand="0" w:noVBand="1"/>
@@ -547,7 +522,7 @@
                       <w:color w:val="FFFFFF"/>
                       <w:sz w:val="46"/>
                     </w:rPr>
-                    <w:t xml:space="preserve">UTE - BARREIRINHA</w:t>
+                    <w:t xml:space="preserve">UTE - </w:t>
                   </w:r>
                 </w:p>
               </w:tc>
@@ -564,10 +539,10 @@
               <w:tblW w:w="0" w:type="auto"/>
               <w:jc w:val="center"/>
               <w:tblBorders>
-                <w:top w:val="single" w:sz="96" w:space="0" w:color="000000"/>
-                <w:left w:val="single" w:sz="96" w:space="0" w:color="000000"/>
-                <w:bottom w:val="single" w:sz="96" w:space="0" w:color="000000"/>
-                <w:right w:val="single" w:sz="96" w:space="0" w:color="000000"/>
+                <w:top w:val="single" w:sz="10" w:space="0" w:color="007A3D"/>
+                <w:left w:val="single" w:sz="10" w:space="0" w:color="007A3D"/>
+                <w:bottom w:val="single" w:sz="10" w:space="0" w:color="007A3D"/>
+                <w:right w:val="single" w:sz="10" w:space="0" w:color="007A3D"/>
               </w:tblBorders>
               <w:tblLayout w:type="fixed"/>
               <w:tblLook w:val="04A0" w:firstRow="1" w:lastRow="0" w:firstColumn="1" w:lastColumn="0" w:noHBand="0" w:noVBand="1"/>
@@ -631,10 +606,10 @@
               <w:tblW w:w="0" w:type="auto"/>
               <w:jc w:val="center"/>
               <w:tblBorders>
-                <w:top w:val="single" w:sz="96" w:space="0" w:color="000000"/>
-                <w:left w:val="single" w:sz="96" w:space="0" w:color="000000"/>
-                <w:bottom w:val="single" w:sz="96" w:space="0" w:color="000000"/>
-                <w:right w:val="single" w:sz="96" w:space="0" w:color="000000"/>
+                <w:top w:val="single" w:sz="10" w:space="0" w:color="007A3D"/>
+                <w:left w:val="single" w:sz="10" w:space="0" w:color="007A3D"/>
+                <w:bottom w:val="single" w:sz="10" w:space="0" w:color="007A3D"/>
+                <w:right w:val="single" w:sz="10" w:space="0" w:color="007A3D"/>
               </w:tblBorders>
               <w:tblLayout w:type="fixed"/>
               <w:tblLook w:val="04A0" w:firstRow="1" w:lastRow="0" w:firstColumn="1" w:lastColumn="0" w:noHBand="0" w:noVBand="1"/>
@@ -670,7 +645,7 @@
                       <w:color w:val="000000"/>
                       <w:sz w:val="40"/>
                     </w:rPr>
-                    <w:t>01 AMOSTRAS DE ÓLEO</w:t>
+                    <w:t>00</w:t>
                   </w:r>
                   <w:r>
                     <w:rPr>
@@ -678,7 +653,7 @@
                       <w:color w:val="000000"/>
                       <w:sz w:val="40"/>
                     </w:rPr>
-                    <w:t xml:space="preserve"/>
+                    <w:t xml:space="preserve"> AMOSTRAS DE ÓLEO</w:t>
                   </w:r>
                 </w:p>
               </w:tc>
@@ -695,10 +670,10 @@
               <w:tblW w:w="0" w:type="auto"/>
               <w:jc w:val="center"/>
               <w:tblBorders>
-                <w:top w:val="single" w:sz="96" w:space="0" w:color="000000"/>
-                <w:left w:val="single" w:sz="96" w:space="0" w:color="000000"/>
-                <w:bottom w:val="single" w:sz="96" w:space="0" w:color="000000"/>
-                <w:right w:val="single" w:sz="96" w:space="0" w:color="000000"/>
+                <w:top w:val="single" w:sz="10" w:space="0" w:color="007A3D"/>
+                <w:left w:val="single" w:sz="10" w:space="0" w:color="007A3D"/>
+                <w:bottom w:val="single" w:sz="10" w:space="0" w:color="007A3D"/>
+                <w:right w:val="single" w:sz="10" w:space="0" w:color="007A3D"/>
               </w:tblBorders>
               <w:tblLayout w:type="fixed"/>
               <w:tblLook w:val="04A0" w:firstRow="1" w:lastRow="0" w:firstColumn="1" w:lastColumn="0" w:noHBand="0" w:noVBand="1"/>
@@ -762,10 +737,10 @@
               <w:tblW w:w="0" w:type="auto"/>
               <w:jc w:val="center"/>
               <w:tblBorders>
-                <w:top w:val="single" w:sz="96" w:space="0" w:color="000000"/>
-                <w:left w:val="single" w:sz="96" w:space="0" w:color="000000"/>
-                <w:bottom w:val="single" w:sz="96" w:space="0" w:color="000000"/>
-                <w:right w:val="single" w:sz="96" w:space="0" w:color="000000"/>
+                <w:top w:val="single" w:sz="10" w:space="0" w:color="007A3D"/>
+                <w:left w:val="single" w:sz="10" w:space="0" w:color="007A3D"/>
+                <w:bottom w:val="single" w:sz="10" w:space="0" w:color="007A3D"/>
+                <w:right w:val="single" w:sz="10" w:space="0" w:color="007A3D"/>
               </w:tblBorders>
               <w:tblLayout w:type="fixed"/>
               <w:tblLook w:val="04A0" w:firstRow="1" w:lastRow="0" w:firstColumn="1" w:lastColumn="0" w:noHBand="0" w:noVBand="1"/>
@@ -801,7 +776,7 @@
                       <w:color w:val="000000"/>
                       <w:sz w:val="40"/>
                     </w:rPr>
-                    <w:t>DATA: 31/08/2026</w:t>
+                    <w:t>DATA: 00 / 00 / 2026</w:t>
                   </w:r>
                 </w:p>
               </w:tc>

</xml_diff>